<commit_message>
Update CV docx with latest edits
Manual edits made directly in Word (experience details, employment
type, etc.) — committing now that editing is finished.
</commit_message>
<xml_diff>
--- a/public/cv/Mohammed-Mohasin-CV.docx
+++ b/public/cv/Mohammed-Mohasin-CV.docx
@@ -103,50 +103,21 @@
     </w:p>
     <w:p>
       <w:pPr>
-        <w:spacing w:after="100"/>
-        <w:rPr>
-          <w:sz w:val="22"/>
-          <w:szCs w:val="22"/>
-        </w:rPr>
-      </w:pPr>
-      <w:r>
-        <w:rPr>
-          <w:sz w:val="22"/>
-          <w:szCs w:val="22"/>
-        </w:rPr>
-        <w:t>I got into web development in 2012 — started as a developer, and somewhere along the way ended up leading the team building the platforms I used to build myself. Most of that time has been at SEBPO, working on eCommerce and business platforms for clients across the US, Australia, and a few other places. Day to day that's architecture calls, code reviews, sprint planning, and talking directly to clients — making sure what actually ships matches what they came to us for, not just what's easiest to build.</w:t>
-      </w:r>
-    </w:p>
-    <w:p>
-      <w:pPr>
-        <w:spacing w:after="100"/>
-        <w:rPr>
-          <w:sz w:val="22"/>
-          <w:szCs w:val="22"/>
-        </w:rPr>
-      </w:pPr>
-      <w:r>
-        <w:rPr>
-          <w:sz w:val="22"/>
-          <w:szCs w:val="22"/>
-        </w:rPr>
-        <w:t xml:space="preserve">A store that converts better, a checkout that doesn't lose people halfway through, a backend that holds up when traffic spikes instead of falling over — that's the goal, mostly working in PHP, Node.js, Express, TypeScript, React, Next.js, </w:t>
-      </w:r>
-      <w:proofErr w:type="spellStart"/>
-      <w:r>
-        <w:rPr>
-          <w:sz w:val="22"/>
-          <w:szCs w:val="22"/>
-        </w:rPr>
-        <w:t>NestJS</w:t>
-      </w:r>
-      <w:proofErr w:type="spellEnd"/>
-      <w:r>
-        <w:rPr>
-          <w:sz w:val="22"/>
-          <w:szCs w:val="22"/>
-        </w:rPr>
-        <w:t>, and AWS. I've also been using AI tools like Claude Code and Codex as part of how I actually build, fitting MCP servers and custom skills into real workflows instead of generic prompting. I'm finishing my PMP certification now, mostly to put a formal label on the project management side I've already been doing for years.</w:t>
+        <w:pBdr>
+          <w:bottom w:val="single" w:sz="6" w:space="3" w:color="1F4E5F"/>
+        </w:pBdr>
+        <w:spacing w:before="260" w:after="100"/>
+        <w:rPr>
+          <w:sz w:val="24"/>
+          <w:szCs w:val="24"/>
+        </w:rPr>
+      </w:pPr>
+      <w:r>
+        <w:rPr>
+          <w:sz w:val="24"/>
+          <w:szCs w:val="24"/>
+        </w:rPr>
+        <w:t>Full-stack developer with years of experience working with clients across the US, Australia, and beyond. I own what I build end to end, from understanding what a client actually needs to shipping the solution. That means making sure the final product lines up with the business goal, not just what's easiest to build.</w:t>
       </w:r>
     </w:p>
     <w:p>
@@ -189,12 +160,6 @@
         <w:gridCol w:w="7800"/>
       </w:tblGrid>
       <w:tr>
-        <w:tblPrEx>
-          <w:tblCellMar>
-            <w:top w:w="0" w:type="dxa"/>
-            <w:bottom w:w="0" w:type="dxa"/>
-          </w:tblCellMar>
-        </w:tblPrEx>
         <w:tc>
           <w:tcPr>
             <w:tcW w:w="3000" w:type="dxa"/>
@@ -265,12 +230,6 @@
         </w:tc>
       </w:tr>
       <w:tr>
-        <w:tblPrEx>
-          <w:tblCellMar>
-            <w:top w:w="0" w:type="dxa"/>
-            <w:bottom w:w="0" w:type="dxa"/>
-          </w:tblCellMar>
-        </w:tblPrEx>
         <w:tc>
           <w:tcPr>
             <w:tcW w:w="3000" w:type="dxa"/>
@@ -316,12 +275,6 @@
         </w:tc>
       </w:tr>
       <w:tr>
-        <w:tblPrEx>
-          <w:tblCellMar>
-            <w:top w:w="0" w:type="dxa"/>
-            <w:bottom w:w="0" w:type="dxa"/>
-          </w:tblCellMar>
-        </w:tblPrEx>
         <w:tc>
           <w:tcPr>
             <w:tcW w:w="3000" w:type="dxa"/>
@@ -367,12 +320,6 @@
         </w:tc>
       </w:tr>
       <w:tr>
-        <w:tblPrEx>
-          <w:tblCellMar>
-            <w:top w:w="0" w:type="dxa"/>
-            <w:bottom w:w="0" w:type="dxa"/>
-          </w:tblCellMar>
-        </w:tblPrEx>
         <w:tc>
           <w:tcPr>
             <w:tcW w:w="3000" w:type="dxa"/>
@@ -418,12 +365,6 @@
         </w:tc>
       </w:tr>
       <w:tr>
-        <w:tblPrEx>
-          <w:tblCellMar>
-            <w:top w:w="0" w:type="dxa"/>
-            <w:bottom w:w="0" w:type="dxa"/>
-          </w:tblCellMar>
-        </w:tblPrEx>
         <w:tc>
           <w:tcPr>
             <w:tcW w:w="3000" w:type="dxa"/>
@@ -537,23 +478,21 @@
           <w:sz w:val="21"/>
           <w:szCs w:val="21"/>
         </w:rPr>
-        <w:t xml:space="preserve">Coordinate a team of 8 </w:t>
-      </w:r>
-      <w:proofErr w:type="gramStart"/>
-      <w:r>
-        <w:rPr>
-          <w:sz w:val="21"/>
-          <w:szCs w:val="21"/>
-        </w:rPr>
-        <w:t>developers</w:t>
-      </w:r>
-      <w:proofErr w:type="gramEnd"/>
-      <w:r>
-        <w:rPr>
-          <w:sz w:val="21"/>
-          <w:szCs w:val="21"/>
-        </w:rPr>
-        <w:t xml:space="preserve"> day to day — task assignment, sprint planning, and delivery tracking across up to 5 concurrent projects</w:t>
+        <w:t xml:space="preserve">Coordinate a team of 8 developers </w:t>
+      </w:r>
+      <w:r>
+        <w:rPr>
+          <w:sz w:val="21"/>
+          <w:szCs w:val="21"/>
+        </w:rPr>
+        <w:t>day-to-day</w:t>
+      </w:r>
+      <w:r>
+        <w:rPr>
+          <w:sz w:val="21"/>
+          <w:szCs w:val="21"/>
+        </w:rPr>
+        <w:t xml:space="preserve"> — task assignment, sprint planning, and delivery tracking across up to 5 concurrent projects</w:t>
       </w:r>
     </w:p>
     <w:p>
@@ -658,21 +597,6 @@
         </w:rPr>
         <w:tab/>
         <w:t>Jul 2021 – Jul 2022</w:t>
-      </w:r>
-    </w:p>
-    <w:p>
-      <w:pPr>
-        <w:spacing w:after="60"/>
-      </w:pPr>
-      <w:r>
-        <w:rPr>
-          <w:i/>
-          <w:iCs/>
-          <w:color w:val="595959"/>
-          <w:sz w:val="18"/>
-          <w:szCs w:val="18"/>
-        </w:rPr>
-        <w:t>Concurrent contract engagement alongside role at SEBPO</w:t>
       </w:r>
     </w:p>
     <w:p>
@@ -2093,6 +2017,18 @@
       <w:szCs w:val="20"/>
     </w:rPr>
   </w:style>
+  <w:style w:type="paragraph" w:customStyle="1" w:styleId="font-claude-response-body">
+    <w:name w:val="font-claude-response-body"/>
+    <w:basedOn w:val="Normal"/>
+    <w:rsid w:val="00E3553B"/>
+    <w:pPr>
+      <w:spacing w:before="100" w:beforeAutospacing="1" w:after="100" w:afterAutospacing="1"/>
+    </w:pPr>
+    <w:rPr>
+      <w:sz w:val="24"/>
+      <w:szCs w:val="24"/>
+    </w:rPr>
+  </w:style>
 </w:styles>
 </file>
 

</xml_diff>

<commit_message>
Reword vendor-integration bullet, update CV docx
Dropped the indefinite articles ("a"/"an") from the payment
gateway / SMS gateway vendor-communication bullet in the experience
list - reads as broader vendor/provider management rather than a
one-off single integration.
</commit_message>
<xml_diff>
--- a/public/cv/Mohammed-Mohasin-CV.docx
+++ b/public/cv/Mohammed-Mohasin-CV.docx
@@ -55,8 +55,33 @@
           <w:sz w:val="18"/>
           <w:szCs w:val="18"/>
         </w:rPr>
-        <w:t>linkedin.com/in/mohammed-mohasin  |  github.com/mohsin86  |  mohammed-mohasin.vercel.app</w:t>
-      </w:r>
+        <w:t>linkedin.com/in/</w:t>
+      </w:r>
+      <w:proofErr w:type="spellStart"/>
+      <w:r>
+        <w:rPr>
+          <w:sz w:val="18"/>
+          <w:szCs w:val="18"/>
+        </w:rPr>
+        <w:t>mohammed-mohasin</w:t>
+      </w:r>
+      <w:proofErr w:type="spellEnd"/>
+      <w:r>
+        <w:rPr>
+          <w:sz w:val="18"/>
+          <w:szCs w:val="18"/>
+        </w:rPr>
+        <w:t xml:space="preserve">  |  github.com/mohsin86  |  </w:t>
+      </w:r>
+      <w:proofErr w:type="spellStart"/>
+      <w:r>
+        <w:rPr>
+          <w:sz w:val="18"/>
+          <w:szCs w:val="18"/>
+        </w:rPr>
+        <w:t>mohammed-mohasin.vercel.app</w:t>
+      </w:r>
+      <w:proofErr w:type="spellEnd"/>
     </w:p>
     <w:p>
       <w:pPr>
@@ -174,7 +199,23 @@
                 <w:sz w:val="19"/>
                 <w:szCs w:val="19"/>
               </w:rPr>
-              <w:t xml:space="preserve">PHP, Node.js, Express.js, TypeScript, React, Next.js, NestJS, WordPress, WooCommerce, </w:t>
+              <w:t xml:space="preserve">PHP, Node.js, Express.js, TypeScript, React, Next.js, </w:t>
+            </w:r>
+            <w:proofErr w:type="spellStart"/>
+            <w:r>
+              <w:rPr>
+                <w:sz w:val="19"/>
+                <w:szCs w:val="19"/>
+              </w:rPr>
+              <w:t>NestJS</w:t>
+            </w:r>
+            <w:proofErr w:type="spellEnd"/>
+            <w:r>
+              <w:rPr>
+                <w:sz w:val="19"/>
+                <w:szCs w:val="19"/>
+              </w:rPr>
+              <w:t xml:space="preserve">, WordPress, WooCommerce, </w:t>
             </w:r>
             <w:r>
               <w:rPr>
@@ -189,8 +230,17 @@
                 <w:sz w:val="19"/>
                 <w:szCs w:val="19"/>
               </w:rPr>
-              <w:t>MySQL, PostgreSQL, MongoDB, TypeORM</w:t>
+              <w:t xml:space="preserve">MySQL, PostgreSQL, MongoDB, </w:t>
             </w:r>
+            <w:proofErr w:type="spellStart"/>
+            <w:r>
+              <w:rPr>
+                <w:sz w:val="19"/>
+                <w:szCs w:val="19"/>
+              </w:rPr>
+              <w:t>TypeORM</w:t>
+            </w:r>
+            <w:proofErr w:type="spellEnd"/>
           </w:p>
         </w:tc>
       </w:tr>
@@ -502,13 +552,17 @@
           <w:numId w:val="2"/>
         </w:numPr>
         <w:spacing w:after="60"/>
-      </w:pPr>
-      <w:r>
-        <w:rPr>
-          <w:sz w:val="21"/>
-          <w:szCs w:val="21"/>
-        </w:rPr>
-        <w:t>Manage vendor communication for third-party integrations — 1 payment gateway and 1 SMS gateway (OTP-based login authentication)</w:t>
+        <w:rPr>
+          <w:sz w:val="21"/>
+          <w:szCs w:val="21"/>
+        </w:rPr>
+      </w:pPr>
+      <w:r>
+        <w:rPr>
+          <w:sz w:val="21"/>
+          <w:szCs w:val="21"/>
+        </w:rPr>
+        <w:t>Manage vendor communication for third-party integrations — payment gateway and SMS gateway (OTP-based login authentication) providers</w:t>
       </w:r>
     </w:p>
     <w:p>
@@ -578,7 +632,23 @@
           <w:sz w:val="21"/>
           <w:szCs w:val="21"/>
         </w:rPr>
-        <w:t>Built custom WordPress plugins, themes, and ACF integrations for YourLifeChoices (yourlifechoices.com.au), one of Australia's larger lifestyle platforms</w:t>
+        <w:t xml:space="preserve">Built custom WordPress plugins, themes, and ACF integrations for </w:t>
+      </w:r>
+      <w:proofErr w:type="spellStart"/>
+      <w:r>
+        <w:rPr>
+          <w:sz w:val="21"/>
+          <w:szCs w:val="21"/>
+        </w:rPr>
+        <w:t>YourLifeChoices</w:t>
+      </w:r>
+      <w:proofErr w:type="spellEnd"/>
+      <w:r>
+        <w:rPr>
+          <w:sz w:val="21"/>
+          <w:szCs w:val="21"/>
+        </w:rPr>
+        <w:t xml:space="preserve"> (yourlifechoices.com.au), one of Australia's larger lifestyle platforms</w:t>
       </w:r>
     </w:p>
     <w:p>
@@ -668,6 +738,7 @@
         <w:lastRenderedPageBreak/>
         <w:t xml:space="preserve">Software Engineer · </w:t>
       </w:r>
+      <w:proofErr w:type="spellStart"/>
       <w:r>
         <w:rPr>
           <w:b/>
@@ -676,7 +747,18 @@
           <w:sz w:val="21"/>
           <w:szCs w:val="21"/>
         </w:rPr>
-        <w:t>Dropndot Solutions</w:t>
+        <w:t>Dropndot</w:t>
+      </w:r>
+      <w:proofErr w:type="spellEnd"/>
+      <w:r>
+        <w:rPr>
+          <w:b/>
+          <w:bCs/>
+          <w:color w:val="1F4E5F"/>
+          <w:sz w:val="21"/>
+          <w:szCs w:val="21"/>
+        </w:rPr>
+        <w:t xml:space="preserve"> Solutions</w:t>
       </w:r>
       <w:r>
         <w:rPr>
@@ -850,12 +932,21 @@
         </w:numPr>
         <w:spacing w:after="60"/>
       </w:pPr>
-      <w:r>
-        <w:rPr>
-          <w:sz w:val="21"/>
-          <w:szCs w:val="21"/>
-        </w:rPr>
-        <w:t>DataCamp Python Courses</w:t>
+      <w:proofErr w:type="spellStart"/>
+      <w:r>
+        <w:rPr>
+          <w:sz w:val="21"/>
+          <w:szCs w:val="21"/>
+        </w:rPr>
+        <w:t>DataCamp</w:t>
+      </w:r>
+      <w:proofErr w:type="spellEnd"/>
+      <w:r>
+        <w:rPr>
+          <w:sz w:val="21"/>
+          <w:szCs w:val="21"/>
+        </w:rPr>
+        <w:t xml:space="preserve"> Python Courses</w:t>
       </w:r>
     </w:p>
     <w:p>
@@ -920,7 +1011,23 @@
           <w:sz w:val="21"/>
           <w:szCs w:val="21"/>
         </w:rPr>
-        <w:t>Auto Garage Services — full-stack, role-based garage operations platform (Next.js, NestJS, PostgreSQL) — github.com/mohsin86/auto-garage-services</w:t>
+        <w:t xml:space="preserve">Auto Garage Services — full-stack, role-based garage operations platform (Next.js, </w:t>
+      </w:r>
+      <w:proofErr w:type="spellStart"/>
+      <w:r>
+        <w:rPr>
+          <w:sz w:val="21"/>
+          <w:szCs w:val="21"/>
+        </w:rPr>
+        <w:t>NestJS</w:t>
+      </w:r>
+      <w:proofErr w:type="spellEnd"/>
+      <w:r>
+        <w:rPr>
+          <w:sz w:val="21"/>
+          <w:szCs w:val="21"/>
+        </w:rPr>
+        <w:t>, PostgreSQL) — github.com/mohsin86/auto-garage-services</w:t>
       </w:r>
     </w:p>
     <w:p>
@@ -984,7 +1091,23 @@
           <w:sz w:val="21"/>
           <w:szCs w:val="21"/>
         </w:rPr>
-        <w:t>Al Musaidah Foundation — non-profit organization website (WordPress, PHP, Bootstrap)</w:t>
+        <w:t xml:space="preserve">Al </w:t>
+      </w:r>
+      <w:proofErr w:type="spellStart"/>
+      <w:r>
+        <w:rPr>
+          <w:sz w:val="21"/>
+          <w:szCs w:val="21"/>
+        </w:rPr>
+        <w:t>Musaidah</w:t>
+      </w:r>
+      <w:proofErr w:type="spellEnd"/>
+      <w:r>
+        <w:rPr>
+          <w:sz w:val="21"/>
+          <w:szCs w:val="21"/>
+        </w:rPr>
+        <w:t xml:space="preserve"> Foundation — non-profit organization website (WordPress, PHP, Bootstrap)</w:t>
       </w:r>
     </w:p>
     <w:p>
@@ -1033,7 +1156,29 @@
           <w:sz w:val="18"/>
           <w:szCs w:val="18"/>
         </w:rPr>
-        <w:t>Full project details: mohammed-mohasin.vercel.app → Projects page</w:t>
+        <w:t xml:space="preserve">Full project details: </w:t>
+      </w:r>
+      <w:proofErr w:type="spellStart"/>
+      <w:r>
+        <w:rPr>
+          <w:i/>
+          <w:iCs/>
+          <w:color w:val="595959"/>
+          <w:sz w:val="18"/>
+          <w:szCs w:val="18"/>
+        </w:rPr>
+        <w:t>mohammed-mohasin.vercel.app</w:t>
+      </w:r>
+      <w:proofErr w:type="spellEnd"/>
+      <w:r>
+        <w:rPr>
+          <w:i/>
+          <w:iCs/>
+          <w:color w:val="595959"/>
+          <w:sz w:val="18"/>
+          <w:szCs w:val="18"/>
+        </w:rPr>
+        <w:t xml:space="preserve"> → Projects page</w:t>
       </w:r>
     </w:p>
     <w:p>
@@ -1091,7 +1236,23 @@
           <w:b/>
           <w:bCs/>
         </w:rPr>
-        <w:t>Md. Joynal Abedin Parag</w:t>
+        <w:t xml:space="preserve">Md. </w:t>
+      </w:r>
+      <w:proofErr w:type="spellStart"/>
+      <w:r>
+        <w:rPr>
+          <w:b/>
+          <w:bCs/>
+        </w:rPr>
+        <w:t>Joynal</w:t>
+      </w:r>
+      <w:proofErr w:type="spellEnd"/>
+      <w:r>
+        <w:rPr>
+          <w:b/>
+          <w:bCs/>
+        </w:rPr>
+        <w:t xml:space="preserve"> Abedin Parag</w:t>
       </w:r>
       <w:r>
         <w:t xml:space="preserve"> — Principal Software Engineer, Daniyal Technologies</w:t>
@@ -1107,8 +1268,18 @@
           <w:sz w:val="19"/>
           <w:szCs w:val="19"/>
         </w:rPr>
-        <w:t>+8801814266295  ·  parag.cste@gmail.com  ·  linkedin.com/in/abedin-joynal</w:t>
-      </w:r>
+        <w:t>+8801814266295  ·  parag.cste@gmail.com  ·  linkedin.com/in/</w:t>
+      </w:r>
+      <w:proofErr w:type="spellStart"/>
+      <w:r>
+        <w:rPr>
+          <w:color w:val="595959"/>
+          <w:sz w:val="19"/>
+          <w:szCs w:val="19"/>
+        </w:rPr>
+        <w:t>abedin-joynal</w:t>
+      </w:r>
+      <w:proofErr w:type="spellEnd"/>
     </w:p>
     <w:sectPr>
       <w:pgSz w:w="12240" w:h="15840"/>

</xml_diff>

<commit_message>
Add Tools & Libraries skills category, move TypeORM into it
New category (Puppeteer, GSAP, OpenAPI, TypeORM, Prisma, Mongoose,
Eloquent, Jest, Tailwind CSS, shadcn/ui, Zustand, React Query,
RabbitMQ, SSLCommerz, ACF) added to Core Skills, matching the updated
CV docx. TypeORM moved here from Tech Stack; Docker stays under Cloud
& DevOps rather than duplicating it.
</commit_message>
<xml_diff>
--- a/public/cv/Mohammed-Mohasin-CV.docx
+++ b/public/cv/Mohammed-Mohasin-CV.docx
@@ -55,33 +55,8 @@
           <w:sz w:val="18"/>
           <w:szCs w:val="18"/>
         </w:rPr>
-        <w:t>linkedin.com/in/</w:t>
-      </w:r>
-      <w:proofErr w:type="spellStart"/>
-      <w:r>
-        <w:rPr>
-          <w:sz w:val="18"/>
-          <w:szCs w:val="18"/>
-        </w:rPr>
-        <w:t>mohammed-mohasin</w:t>
-      </w:r>
-      <w:proofErr w:type="spellEnd"/>
-      <w:r>
-        <w:rPr>
-          <w:sz w:val="18"/>
-          <w:szCs w:val="18"/>
-        </w:rPr>
-        <w:t xml:space="preserve">  |  github.com/mohsin86  |  </w:t>
-      </w:r>
-      <w:proofErr w:type="spellStart"/>
-      <w:r>
-        <w:rPr>
-          <w:sz w:val="18"/>
-          <w:szCs w:val="18"/>
-        </w:rPr>
-        <w:t>mohammed-mohasin.vercel.app</w:t>
-      </w:r>
-      <w:proofErr w:type="spellEnd"/>
+        <w:t xml:space="preserve">linkedin.com/in/mohammed-mohasin  |  github.com/mohsin86  |  mohammed-mohasin.vercel.app</w:t>
+      </w:r>
     </w:p>
     <w:p>
       <w:pPr>
@@ -199,23 +174,7 @@
                 <w:sz w:val="19"/>
                 <w:szCs w:val="19"/>
               </w:rPr>
-              <w:t xml:space="preserve">PHP, Node.js, Express.js, TypeScript, React, Next.js, </w:t>
-            </w:r>
-            <w:proofErr w:type="spellStart"/>
-            <w:r>
-              <w:rPr>
-                <w:sz w:val="19"/>
-                <w:szCs w:val="19"/>
-              </w:rPr>
-              <w:t>NestJS</w:t>
-            </w:r>
-            <w:proofErr w:type="spellEnd"/>
-            <w:r>
-              <w:rPr>
-                <w:sz w:val="19"/>
-                <w:szCs w:val="19"/>
-              </w:rPr>
-              <w:t xml:space="preserve">, WordPress, WooCommerce, </w:t>
+              <w:t xml:space="preserve">PHP, Node.js, Express.js, TypeScript, React, Next.js, NestJS, WordPress, WooCommerce, </w:t>
             </w:r>
             <w:r>
               <w:rPr>
@@ -230,17 +189,53 @@
                 <w:sz w:val="19"/>
                 <w:szCs w:val="19"/>
               </w:rPr>
-              <w:t xml:space="preserve">MySQL, PostgreSQL, MongoDB, </w:t>
+              <w:t xml:space="preserve">MySQL, PostgreSQL, MongoDB</w:t>
             </w:r>
-            <w:proofErr w:type="spellStart"/>
+          </w:p>
+        </w:tc>
+      </w:tr>
+      <w:tr>
+        <w:tc>
+          <w:tcPr>
+            <w:tcW w:w="3000" w:type="dxa"/>
+            <w:shd w:val="clear" w:color="auto" w:fill="EDF2F4"/>
+            <w:tcMar>
+              <w:top w:w="80" w:type="dxa"/>
+              <w:left w:w="100" w:type="dxa"/>
+              <w:bottom w:w="80" w:type="dxa"/>
+              <w:right w:w="100" w:type="dxa"/>
+            </w:tcMar>
+          </w:tcPr>
+          <w:p>
+            <w:r>
+              <w:rPr>
+                <w:b/>
+                <w:bCs/>
+                <w:sz w:val="19"/>
+                <w:szCs w:val="19"/>
+              </w:rPr>
+              <w:t>Tools &amp; Libraries</w:t>
+            </w:r>
+          </w:p>
+        </w:tc>
+        <w:tc>
+          <w:tcPr>
+            <w:tcW w:w="7800" w:type="dxa"/>
+            <w:tcMar>
+              <w:top w:w="80" w:type="dxa"/>
+              <w:left w:w="100" w:type="dxa"/>
+              <w:bottom w:w="80" w:type="dxa"/>
+              <w:right w:w="100" w:type="dxa"/>
+            </w:tcMar>
+          </w:tcPr>
+          <w:p>
             <w:r>
               <w:rPr>
                 <w:sz w:val="19"/>
                 <w:szCs w:val="19"/>
               </w:rPr>
-              <w:t>TypeORM</w:t>
+              <w:t>Puppeteer, GSAP, OpenAPI, Docker, TypeORM, Prisma, Mongoose, Eloquent (Laravel's ORM), Jest, Tailwind CSS, shadcn/ui, Zustand, React Query, RabbitMQ, SSLCommerz, ACF (Advanced Custom Fields for WordPress)</w:t>
             </w:r>
-            <w:proofErr w:type="spellEnd"/>
           </w:p>
         </w:tc>
       </w:tr>
@@ -493,21 +488,7 @@
           <w:sz w:val="21"/>
           <w:szCs w:val="21"/>
         </w:rPr>
-        <w:t xml:space="preserve">Coordinate a team of 8 developers </w:t>
-      </w:r>
-      <w:r>
-        <w:rPr>
-          <w:sz w:val="21"/>
-          <w:szCs w:val="21"/>
-        </w:rPr>
-        <w:t>day-to-day</w:t>
-      </w:r>
-      <w:r>
-        <w:rPr>
-          <w:sz w:val="21"/>
-          <w:szCs w:val="21"/>
-        </w:rPr>
-        <w:t xml:space="preserve"> — task assignment, sprint planning, and delivery tracking across up to 5 concurrent projects</w:t>
+        <w:t xml:space="preserve">Coordinate a team of 8 developers day-to-day — task assignment, sprint planning, and delivery tracking across up to 5 concurrent projects</w:t>
       </w:r>
     </w:p>
     <w:p>
@@ -632,23 +613,7 @@
           <w:sz w:val="21"/>
           <w:szCs w:val="21"/>
         </w:rPr>
-        <w:t xml:space="preserve">Built custom WordPress plugins, themes, and ACF integrations for </w:t>
-      </w:r>
-      <w:proofErr w:type="spellStart"/>
-      <w:r>
-        <w:rPr>
-          <w:sz w:val="21"/>
-          <w:szCs w:val="21"/>
-        </w:rPr>
-        <w:t>YourLifeChoices</w:t>
-      </w:r>
-      <w:proofErr w:type="spellEnd"/>
-      <w:r>
-        <w:rPr>
-          <w:sz w:val="21"/>
-          <w:szCs w:val="21"/>
-        </w:rPr>
-        <w:t xml:space="preserve"> (yourlifechoices.com.au), one of Australia's larger lifestyle platforms</w:t>
+        <w:t xml:space="preserve">Built custom WordPress plugins, themes, and ACF integrations for YourLifeChoices (yourlifechoices.com.au), one of Australia's larger lifestyle platforms</w:t>
       </w:r>
     </w:p>
     <w:p>
@@ -738,7 +703,6 @@
         <w:lastRenderedPageBreak/>
         <w:t xml:space="preserve">Software Engineer · </w:t>
       </w:r>
-      <w:proofErr w:type="spellStart"/>
       <w:r>
         <w:rPr>
           <w:b/>
@@ -747,18 +711,7 @@
           <w:sz w:val="21"/>
           <w:szCs w:val="21"/>
         </w:rPr>
-        <w:t>Dropndot</w:t>
-      </w:r>
-      <w:proofErr w:type="spellEnd"/>
-      <w:r>
-        <w:rPr>
-          <w:b/>
-          <w:bCs/>
-          <w:color w:val="1F4E5F"/>
-          <w:sz w:val="21"/>
-          <w:szCs w:val="21"/>
-        </w:rPr>
-        <w:t xml:space="preserve"> Solutions</w:t>
+        <w:t xml:space="preserve">Dropndot Solutions</w:t>
       </w:r>
       <w:r>
         <w:rPr>
@@ -932,21 +885,12 @@
         </w:numPr>
         <w:spacing w:after="60"/>
       </w:pPr>
-      <w:proofErr w:type="spellStart"/>
-      <w:r>
-        <w:rPr>
-          <w:sz w:val="21"/>
-          <w:szCs w:val="21"/>
-        </w:rPr>
-        <w:t>DataCamp</w:t>
-      </w:r>
-      <w:proofErr w:type="spellEnd"/>
-      <w:r>
-        <w:rPr>
-          <w:sz w:val="21"/>
-          <w:szCs w:val="21"/>
-        </w:rPr>
-        <w:t xml:space="preserve"> Python Courses</w:t>
+      <w:r>
+        <w:rPr>
+          <w:sz w:val="21"/>
+          <w:szCs w:val="21"/>
+        </w:rPr>
+        <w:t xml:space="preserve">DataCamp Python Courses</w:t>
       </w:r>
     </w:p>
     <w:p>
@@ -1011,23 +955,7 @@
           <w:sz w:val="21"/>
           <w:szCs w:val="21"/>
         </w:rPr>
-        <w:t xml:space="preserve">Auto Garage Services — full-stack, role-based garage operations platform (Next.js, </w:t>
-      </w:r>
-      <w:proofErr w:type="spellStart"/>
-      <w:r>
-        <w:rPr>
-          <w:sz w:val="21"/>
-          <w:szCs w:val="21"/>
-        </w:rPr>
-        <w:t>NestJS</w:t>
-      </w:r>
-      <w:proofErr w:type="spellEnd"/>
-      <w:r>
-        <w:rPr>
-          <w:sz w:val="21"/>
-          <w:szCs w:val="21"/>
-        </w:rPr>
-        <w:t>, PostgreSQL) — github.com/mohsin86/auto-garage-services</w:t>
+        <w:t xml:space="preserve">Auto Garage Services — full-stack, role-based garage operations platform (Next.js, NestJS, PostgreSQL) — github.com/mohsin86/auto-garage-services</w:t>
       </w:r>
     </w:p>
     <w:p>
@@ -1091,23 +1019,7 @@
           <w:sz w:val="21"/>
           <w:szCs w:val="21"/>
         </w:rPr>
-        <w:t xml:space="preserve">Al </w:t>
-      </w:r>
-      <w:proofErr w:type="spellStart"/>
-      <w:r>
-        <w:rPr>
-          <w:sz w:val="21"/>
-          <w:szCs w:val="21"/>
-        </w:rPr>
-        <w:t>Musaidah</w:t>
-      </w:r>
-      <w:proofErr w:type="spellEnd"/>
-      <w:r>
-        <w:rPr>
-          <w:sz w:val="21"/>
-          <w:szCs w:val="21"/>
-        </w:rPr>
-        <w:t xml:space="preserve"> Foundation — non-profit organization website (WordPress, PHP, Bootstrap)</w:t>
+        <w:t xml:space="preserve">Al Musaidah Foundation — non-profit organization website (WordPress, PHP, Bootstrap)</w:t>
       </w:r>
     </w:p>
     <w:p>
@@ -1156,29 +1068,7 @@
           <w:sz w:val="18"/>
           <w:szCs w:val="18"/>
         </w:rPr>
-        <w:t xml:space="preserve">Full project details: </w:t>
-      </w:r>
-      <w:proofErr w:type="spellStart"/>
-      <w:r>
-        <w:rPr>
-          <w:i/>
-          <w:iCs/>
-          <w:color w:val="595959"/>
-          <w:sz w:val="18"/>
-          <w:szCs w:val="18"/>
-        </w:rPr>
-        <w:t>mohammed-mohasin.vercel.app</w:t>
-      </w:r>
-      <w:proofErr w:type="spellEnd"/>
-      <w:r>
-        <w:rPr>
-          <w:i/>
-          <w:iCs/>
-          <w:color w:val="595959"/>
-          <w:sz w:val="18"/>
-          <w:szCs w:val="18"/>
-        </w:rPr>
-        <w:t xml:space="preserve"> → Projects page</w:t>
+        <w:t xml:space="preserve">Full project details: mohammed-mohasin.vercel.app → Projects page</w:t>
       </w:r>
     </w:p>
     <w:p>
@@ -1236,23 +1126,7 @@
           <w:b/>
           <w:bCs/>
         </w:rPr>
-        <w:t xml:space="preserve">Md. </w:t>
-      </w:r>
-      <w:proofErr w:type="spellStart"/>
-      <w:r>
-        <w:rPr>
-          <w:b/>
-          <w:bCs/>
-        </w:rPr>
-        <w:t>Joynal</w:t>
-      </w:r>
-      <w:proofErr w:type="spellEnd"/>
-      <w:r>
-        <w:rPr>
-          <w:b/>
-          <w:bCs/>
-        </w:rPr>
-        <w:t xml:space="preserve"> Abedin Parag</w:t>
+        <w:t xml:space="preserve">Md. Joynal Abedin Parag</w:t>
       </w:r>
       <w:r>
         <w:t xml:space="preserve"> — Principal Software Engineer, Daniyal Technologies</w:t>
@@ -1268,18 +1142,8 @@
           <w:sz w:val="19"/>
           <w:szCs w:val="19"/>
         </w:rPr>
-        <w:t>+8801814266295  ·  parag.cste@gmail.com  ·  linkedin.com/in/</w:t>
-      </w:r>
-      <w:proofErr w:type="spellStart"/>
-      <w:r>
-        <w:rPr>
-          <w:color w:val="595959"/>
-          <w:sz w:val="19"/>
-          <w:szCs w:val="19"/>
-        </w:rPr>
-        <w:t>abedin-joynal</w:t>
-      </w:r>
-      <w:proofErr w:type="spellEnd"/>
+        <w:t>+8801814266295  ·  parag.cste@gmail.com  ·  linkedin.com/in/abedin-joynal</w:t>
+      </w:r>
     </w:p>
     <w:sectPr>
       <w:pgSz w:w="12240" w:h="15840"/>

</xml_diff>

<commit_message>
Fix incorrect education degree name, update CV docx
Degree corrected to "The Bachelor of Science in Computer Science and
Engineering (B.Sc. in CSE)".
</commit_message>
<xml_diff>
--- a/public/cv/Mohammed-Mohasin-CV.docx
+++ b/public/cv/Mohammed-Mohasin-CV.docx
@@ -55,8 +55,33 @@
           <w:sz w:val="18"/>
           <w:szCs w:val="18"/>
         </w:rPr>
-        <w:t xml:space="preserve">linkedin.com/in/mohammed-mohasin  |  github.com/mohsin86  |  mohammed-mohasin.vercel.app</w:t>
-      </w:r>
+        <w:t>linkedin.com/in/</w:t>
+      </w:r>
+      <w:proofErr w:type="spellStart"/>
+      <w:r>
+        <w:rPr>
+          <w:sz w:val="18"/>
+          <w:szCs w:val="18"/>
+        </w:rPr>
+        <w:t>mohammed-mohasin</w:t>
+      </w:r>
+      <w:proofErr w:type="spellEnd"/>
+      <w:r>
+        <w:rPr>
+          <w:sz w:val="18"/>
+          <w:szCs w:val="18"/>
+        </w:rPr>
+        <w:t xml:space="preserve">  |  github.com/mohsin86  |  </w:t>
+      </w:r>
+      <w:proofErr w:type="spellStart"/>
+      <w:r>
+        <w:rPr>
+          <w:sz w:val="18"/>
+          <w:szCs w:val="18"/>
+        </w:rPr>
+        <w:t>mohammed-mohasin.vercel.app</w:t>
+      </w:r>
+      <w:proofErr w:type="spellEnd"/>
     </w:p>
     <w:p>
       <w:pPr>
@@ -169,19 +194,40 @@
             </w:tcMar>
           </w:tcPr>
           <w:p>
-            <w:r>
-              <w:rPr>
-                <w:sz w:val="19"/>
-                <w:szCs w:val="19"/>
-              </w:rPr>
-              <w:t xml:space="preserve">PHP, Node.js, Express.js, TypeScript, React, Next.js, NestJS, WordPress, WooCommerce, </w:t>
-            </w:r>
-            <w:r>
-              <w:rPr>
-                <w:sz w:val="19"/>
-                <w:szCs w:val="19"/>
+            <w:pPr>
+              <w:rPr>
                 <w:lang w:val="en-US"/>
               </w:rPr>
+            </w:pPr>
+            <w:r>
+              <w:rPr>
+                <w:sz w:val="19"/>
+                <w:szCs w:val="19"/>
+              </w:rPr>
+              <w:t xml:space="preserve">PHP, Node.js, Express.js, TypeScript, React, Next.js, </w:t>
+            </w:r>
+            <w:proofErr w:type="spellStart"/>
+            <w:r>
+              <w:rPr>
+                <w:sz w:val="19"/>
+                <w:szCs w:val="19"/>
+              </w:rPr>
+              <w:t>NestJS</w:t>
+            </w:r>
+            <w:proofErr w:type="spellEnd"/>
+            <w:r>
+              <w:rPr>
+                <w:sz w:val="19"/>
+                <w:szCs w:val="19"/>
+              </w:rPr>
+              <w:t xml:space="preserve">, WordPress, WooCommerce, </w:t>
+            </w:r>
+            <w:r>
+              <w:rPr>
+                <w:sz w:val="19"/>
+                <w:szCs w:val="19"/>
+                <w:lang w:val="en-US"/>
+              </w:rPr>
               <w:t xml:space="preserve">Laravel, </w:t>
             </w:r>
             <w:r>
@@ -189,7 +235,15 @@
                 <w:sz w:val="19"/>
                 <w:szCs w:val="19"/>
               </w:rPr>
-              <w:t xml:space="preserve">MySQL, PostgreSQL, MongoDB</w:t>
+              <w:t>MySQL, PostgreSQL, MongoDB</w:t>
+            </w:r>
+            <w:r>
+              <w:rPr>
+                <w:sz w:val="19"/>
+                <w:szCs w:val="19"/>
+                <w:lang w:val="en-US"/>
+              </w:rPr>
+              <w:t>, HTML, CSS</w:t>
             </w:r>
           </w:p>
         </w:tc>
@@ -234,7 +288,103 @@
                 <w:sz w:val="19"/>
                 <w:szCs w:val="19"/>
               </w:rPr>
-              <w:t>Puppeteer, GSAP, OpenAPI, Docker, TypeORM, Prisma, Mongoose, Eloquent (Laravel's ORM), Jest, Tailwind CSS, shadcn/ui, Zustand, React Query, RabbitMQ, SSLCommerz, ACF (Advanced Custom Fields for WordPress)</w:t>
+              <w:t xml:space="preserve">Puppeteer, GSAP, </w:t>
+            </w:r>
+            <w:proofErr w:type="spellStart"/>
+            <w:r>
+              <w:rPr>
+                <w:sz w:val="19"/>
+                <w:szCs w:val="19"/>
+              </w:rPr>
+              <w:t>OpenAPI</w:t>
+            </w:r>
+            <w:proofErr w:type="spellEnd"/>
+            <w:r>
+              <w:rPr>
+                <w:sz w:val="19"/>
+                <w:szCs w:val="19"/>
+              </w:rPr>
+              <w:t xml:space="preserve">, Docker, </w:t>
+            </w:r>
+            <w:proofErr w:type="spellStart"/>
+            <w:r>
+              <w:rPr>
+                <w:sz w:val="19"/>
+                <w:szCs w:val="19"/>
+              </w:rPr>
+              <w:t>TypeORM</w:t>
+            </w:r>
+            <w:proofErr w:type="spellEnd"/>
+            <w:r>
+              <w:rPr>
+                <w:sz w:val="19"/>
+                <w:szCs w:val="19"/>
+              </w:rPr>
+              <w:t xml:space="preserve">, Prisma, Mongoose, Eloquent (Laravel's ORM), Jest, Tailwind CSS, </w:t>
+            </w:r>
+            <w:proofErr w:type="spellStart"/>
+            <w:r>
+              <w:rPr>
+                <w:sz w:val="19"/>
+                <w:szCs w:val="19"/>
+              </w:rPr>
+              <w:t>shadcn</w:t>
+            </w:r>
+            <w:proofErr w:type="spellEnd"/>
+            <w:r>
+              <w:rPr>
+                <w:sz w:val="19"/>
+                <w:szCs w:val="19"/>
+              </w:rPr>
+              <w:t>/</w:t>
+            </w:r>
+            <w:proofErr w:type="spellStart"/>
+            <w:r>
+              <w:rPr>
+                <w:sz w:val="19"/>
+                <w:szCs w:val="19"/>
+              </w:rPr>
+              <w:t>ui</w:t>
+            </w:r>
+            <w:proofErr w:type="spellEnd"/>
+            <w:r>
+              <w:rPr>
+                <w:sz w:val="19"/>
+                <w:szCs w:val="19"/>
+              </w:rPr>
+              <w:t xml:space="preserve">, </w:t>
+            </w:r>
+            <w:proofErr w:type="spellStart"/>
+            <w:r>
+              <w:rPr>
+                <w:sz w:val="19"/>
+                <w:szCs w:val="19"/>
+              </w:rPr>
+              <w:t>Zustand</w:t>
+            </w:r>
+            <w:proofErr w:type="spellEnd"/>
+            <w:r>
+              <w:rPr>
+                <w:sz w:val="19"/>
+                <w:szCs w:val="19"/>
+              </w:rPr>
+              <w:t xml:space="preserve">, React Query, RabbitMQ, </w:t>
+            </w:r>
+            <w:proofErr w:type="spellStart"/>
+            <w:r>
+              <w:rPr>
+                <w:sz w:val="19"/>
+                <w:szCs w:val="19"/>
+              </w:rPr>
+              <w:t>SSLCommerz</w:t>
+            </w:r>
+            <w:proofErr w:type="spellEnd"/>
+            <w:r>
+              <w:rPr>
+                <w:sz w:val="19"/>
+                <w:szCs w:val="19"/>
+              </w:rPr>
+              <w:t>, ACF (Advanced Custom Fields for WordPress)</w:t>
             </w:r>
           </w:p>
         </w:tc>
@@ -488,7 +638,7 @@
           <w:sz w:val="21"/>
           <w:szCs w:val="21"/>
         </w:rPr>
-        <w:t xml:space="preserve">Coordinate a team of 8 developers day-to-day — task assignment, sprint planning, and delivery tracking across up to 5 concurrent projects</w:t>
+        <w:t>Coordinate a team of 8 developers day-to-day — task assignment, sprint planning, and delivery tracking across up to 5 concurrent projects</w:t>
       </w:r>
     </w:p>
     <w:p>
@@ -613,7 +763,23 @@
           <w:sz w:val="21"/>
           <w:szCs w:val="21"/>
         </w:rPr>
-        <w:t xml:space="preserve">Built custom WordPress plugins, themes, and ACF integrations for YourLifeChoices (yourlifechoices.com.au), one of Australia's larger lifestyle platforms</w:t>
+        <w:t xml:space="preserve">Built custom WordPress plugins, themes, and ACF integrations for </w:t>
+      </w:r>
+      <w:proofErr w:type="spellStart"/>
+      <w:r>
+        <w:rPr>
+          <w:sz w:val="21"/>
+          <w:szCs w:val="21"/>
+        </w:rPr>
+        <w:t>YourLifeChoices</w:t>
+      </w:r>
+      <w:proofErr w:type="spellEnd"/>
+      <w:r>
+        <w:rPr>
+          <w:sz w:val="21"/>
+          <w:szCs w:val="21"/>
+        </w:rPr>
+        <w:t xml:space="preserve"> (yourlifechoices.com.au), one of Australia's larger lifestyle platforms</w:t>
       </w:r>
     </w:p>
     <w:p>
@@ -703,6 +869,7 @@
         <w:lastRenderedPageBreak/>
         <w:t xml:space="preserve">Software Engineer · </w:t>
       </w:r>
+      <w:proofErr w:type="spellStart"/>
       <w:r>
         <w:rPr>
           <w:b/>
@@ -711,7 +878,18 @@
           <w:sz w:val="21"/>
           <w:szCs w:val="21"/>
         </w:rPr>
-        <w:t xml:space="preserve">Dropndot Solutions</w:t>
+        <w:t>Dropndot</w:t>
+      </w:r>
+      <w:proofErr w:type="spellEnd"/>
+      <w:r>
+        <w:rPr>
+          <w:b/>
+          <w:bCs/>
+          <w:color w:val="1F4E5F"/>
+          <w:sz w:val="21"/>
+          <w:szCs w:val="21"/>
+        </w:rPr>
+        <w:t xml:space="preserve"> Solutions</w:t>
       </w:r>
       <w:r>
         <w:rPr>
@@ -783,10 +961,54 @@
         <w:rPr>
           <w:b/>
           <w:bCs/>
-          <w:sz w:val="21"/>
-          <w:szCs w:val="21"/>
-        </w:rPr>
-        <w:t>Bachelor of Engineering (BE) — Computer Science</w:t>
+          <w:color w:val="1F1F1F"/>
+          <w:sz w:val="21"/>
+          <w:szCs w:val="21"/>
+          <w:shd w:val="clear" w:color="auto" w:fill="FFFFFF"/>
+        </w:rPr>
+        <w:t>The Bachelor of Science in Computer Science and Engineering (</w:t>
+      </w:r>
+      <w:r>
+        <w:rPr>
+          <w:b/>
+          <w:bCs/>
+          <w:color w:val="001D35"/>
+          <w:sz w:val="21"/>
+          <w:szCs w:val="21"/>
+        </w:rPr>
+        <w:t>B.Sc.</w:t>
+      </w:r>
+      <w:r>
+        <w:rPr>
+          <w:b/>
+          <w:bCs/>
+          <w:color w:val="1F1F1F"/>
+          <w:sz w:val="21"/>
+          <w:szCs w:val="21"/>
+          <w:shd w:val="clear" w:color="auto" w:fill="FFFFFF"/>
+        </w:rPr>
+        <w:t> </w:t>
+      </w:r>
+      <w:r>
+        <w:rPr>
+          <w:b/>
+          <w:bCs/>
+          <w:color w:val="001D35"/>
+          <w:sz w:val="21"/>
+          <w:szCs w:val="21"/>
+        </w:rPr>
+        <w:t>in CSE</w:t>
+      </w:r>
+      <w:r>
+        <w:rPr>
+          <w:b/>
+          <w:bCs/>
+          <w:color w:val="1F1F1F"/>
+          <w:sz w:val="21"/>
+          <w:szCs w:val="21"/>
+          <w:shd w:val="clear" w:color="auto" w:fill="FFFFFF"/>
+        </w:rPr>
+        <w:t>)</w:t>
       </w:r>
       <w:r>
         <w:rPr>
@@ -885,12 +1107,21 @@
         </w:numPr>
         <w:spacing w:after="60"/>
       </w:pPr>
-      <w:r>
-        <w:rPr>
-          <w:sz w:val="21"/>
-          <w:szCs w:val="21"/>
-        </w:rPr>
-        <w:t xml:space="preserve">DataCamp Python Courses</w:t>
+      <w:proofErr w:type="spellStart"/>
+      <w:r>
+        <w:rPr>
+          <w:sz w:val="21"/>
+          <w:szCs w:val="21"/>
+        </w:rPr>
+        <w:t>DataCamp</w:t>
+      </w:r>
+      <w:proofErr w:type="spellEnd"/>
+      <w:r>
+        <w:rPr>
+          <w:sz w:val="21"/>
+          <w:szCs w:val="21"/>
+        </w:rPr>
+        <w:t xml:space="preserve"> Python Courses</w:t>
       </w:r>
     </w:p>
     <w:p>
@@ -955,7 +1186,23 @@
           <w:sz w:val="21"/>
           <w:szCs w:val="21"/>
         </w:rPr>
-        <w:t xml:space="preserve">Auto Garage Services — full-stack, role-based garage operations platform (Next.js, NestJS, PostgreSQL) — github.com/mohsin86/auto-garage-services</w:t>
+        <w:t xml:space="preserve">Auto Garage Services — full-stack, role-based garage operations platform (Next.js, </w:t>
+      </w:r>
+      <w:proofErr w:type="spellStart"/>
+      <w:r>
+        <w:rPr>
+          <w:sz w:val="21"/>
+          <w:szCs w:val="21"/>
+        </w:rPr>
+        <w:t>NestJS</w:t>
+      </w:r>
+      <w:proofErr w:type="spellEnd"/>
+      <w:r>
+        <w:rPr>
+          <w:sz w:val="21"/>
+          <w:szCs w:val="21"/>
+        </w:rPr>
+        <w:t>, PostgreSQL) — github.com/mohsin86/auto-garage-services</w:t>
       </w:r>
     </w:p>
     <w:p>
@@ -1019,7 +1266,23 @@
           <w:sz w:val="21"/>
           <w:szCs w:val="21"/>
         </w:rPr>
-        <w:t xml:space="preserve">Al Musaidah Foundation — non-profit organization website (WordPress, PHP, Bootstrap)</w:t>
+        <w:t xml:space="preserve">Al </w:t>
+      </w:r>
+      <w:proofErr w:type="spellStart"/>
+      <w:r>
+        <w:rPr>
+          <w:sz w:val="21"/>
+          <w:szCs w:val="21"/>
+        </w:rPr>
+        <w:t>Musaidah</w:t>
+      </w:r>
+      <w:proofErr w:type="spellEnd"/>
+      <w:r>
+        <w:rPr>
+          <w:sz w:val="21"/>
+          <w:szCs w:val="21"/>
+        </w:rPr>
+        <w:t xml:space="preserve"> Foundation — non-profit organization website (WordPress, PHP, Bootstrap)</w:t>
       </w:r>
     </w:p>
     <w:p>
@@ -1068,7 +1331,29 @@
           <w:sz w:val="18"/>
           <w:szCs w:val="18"/>
         </w:rPr>
-        <w:t xml:space="preserve">Full project details: mohammed-mohasin.vercel.app → Projects page</w:t>
+        <w:t xml:space="preserve">Full project details: </w:t>
+      </w:r>
+      <w:proofErr w:type="spellStart"/>
+      <w:r>
+        <w:rPr>
+          <w:i/>
+          <w:iCs/>
+          <w:color w:val="595959"/>
+          <w:sz w:val="18"/>
+          <w:szCs w:val="18"/>
+        </w:rPr>
+        <w:t>mohammed-mohasin.vercel.app</w:t>
+      </w:r>
+      <w:proofErr w:type="spellEnd"/>
+      <w:r>
+        <w:rPr>
+          <w:i/>
+          <w:iCs/>
+          <w:color w:val="595959"/>
+          <w:sz w:val="18"/>
+          <w:szCs w:val="18"/>
+        </w:rPr>
+        <w:t xml:space="preserve"> → Projects page</w:t>
       </w:r>
     </w:p>
     <w:p>
@@ -1126,7 +1411,23 @@
           <w:b/>
           <w:bCs/>
         </w:rPr>
-        <w:t xml:space="preserve">Md. Joynal Abedin Parag</w:t>
+        <w:t xml:space="preserve">Md. </w:t>
+      </w:r>
+      <w:proofErr w:type="spellStart"/>
+      <w:r>
+        <w:rPr>
+          <w:b/>
+          <w:bCs/>
+        </w:rPr>
+        <w:t>Joynal</w:t>
+      </w:r>
+      <w:proofErr w:type="spellEnd"/>
+      <w:r>
+        <w:rPr>
+          <w:b/>
+          <w:bCs/>
+        </w:rPr>
+        <w:t xml:space="preserve"> Abedin Parag</w:t>
       </w:r>
       <w:r>
         <w:t xml:space="preserve"> — Principal Software Engineer, Daniyal Technologies</w:t>
@@ -1142,8 +1443,18 @@
           <w:sz w:val="19"/>
           <w:szCs w:val="19"/>
         </w:rPr>
-        <w:t>+8801814266295  ·  parag.cste@gmail.com  ·  linkedin.com/in/abedin-joynal</w:t>
-      </w:r>
+        <w:t>+8801814266295  ·  parag.cste@gmail.com  ·  linkedin.com/in/</w:t>
+      </w:r>
+      <w:proofErr w:type="spellStart"/>
+      <w:r>
+        <w:rPr>
+          <w:color w:val="595959"/>
+          <w:sz w:val="19"/>
+          <w:szCs w:val="19"/>
+        </w:rPr>
+        <w:t>abedin-joynal</w:t>
+      </w:r>
+      <w:proofErr w:type="spellEnd"/>
     </w:p>
     <w:sectPr>
       <w:pgSz w:w="12240" w:h="15840"/>

</xml_diff>